<commit_message>
JOTE submission version: Zenodo DOI, cover letter, rebuild
</commit_message>
<xml_diff>
--- a/docs/manuscript/cover_letter.docx
+++ b/docs/manuscript/cover_letter.docx
@@ -85,7 +85,7 @@
         <w:pStyle w:val="BodyText"/>
       </w:pPr>
       <w:r>
-        <w:t xml:space="preserve">A preprint of this article is on OSF Preprints under CC-BY 4.0: DOI [to be inserted]</w:t>
+        <w:t xml:space="preserve">A preprint of this article is on Zenodo under CC-BY 4.0: https://doi.org/10.5281/zenodo.23375065</w:t>
       </w:r>
     </w:p>
     <w:p>
@@ -93,7 +93,7 @@
         <w:pStyle w:val="BodyText"/>
       </w:pPr>
       <w:r>
-        <w:t xml:space="preserve">All data and code are public under the MIT license in the repository https://github.com/rahul-k-mishra/arc3-frame-only-study, at the tags prereg-v1 (commit 19f2a9f25043997d1deffd5976f2f2150e5f086f), prereg-v1.1 (commit 8b2b2b9b432dbea4ba5f62cfceb1aad5558d1ecc) and prereg-v1.2 (commit 66e560645d9d98bca39ee7da9b1039ada1bc579b). The protocol was registered on the Open Science Framework at https://osf.io/2znhw and amended at https://osf.io/zu5vq; both registrations are under embargo, and their registered texts are in the repository.</w:t>
+        <w:t xml:space="preserve">All data and code are public under the MIT license in the repository https://github.com/rahul-k-mishra/arc3-frame-only-study, at the tags prereg-v1 (commit 19f2a9f25043997d1deffd5976f2f2150e5f086f), prereg-v1.1 (commit 8b2b2b9b432dbea4ba5f62cfceb1aad5558d1ecc) and prereg-v1.2 (commit 66e560645d9d98bca39ee7da9b1039ada1bc579b). The protocol was registered on the Open Science Framework at https://osf.io/2znhw and amended at https://osf.io/zu5vq; both registrations are public, and their registered texts are also in the repository.</w:t>
       </w:r>
     </w:p>
     <w:p>

</xml_diff>